<commit_message>
midterm grade info posted in ADMIN
</commit_message>
<xml_diff>
--- a/EXAMS/midterm/solns-midterm-written-portion.docx
+++ b/EXAMS/midterm/solns-midterm-written-portion.docx
@@ -213,6 +213,13 @@
           <w:color w:val="FF0000"/>
         </w:rPr>
       </w:pPr>
+      <w:r>
+        <w:rPr>
+          <w:noProof/>
+          <w:color w:val="FF0000"/>
+        </w:rPr>
+        <w:t xml:space="preserve"> </w:t>
+      </w:r>
       <w:r>
         <w:rPr>
           <w:noProof/>
@@ -479,6 +486,7 @@
         <w:t xml:space="preserve">A. </w:t>
       </w:r>
       <w:proofErr w:type="spellStart"/>
+      <w:proofErr w:type="gramStart"/>
       <w:r>
         <w:rPr>
           <w:rFonts w:ascii="Calibri" w:hAnsi="Calibri" w:cs="Calibri"/>
@@ -486,6 +494,7 @@
         <w:t>df.iloc</w:t>
       </w:r>
       <w:proofErr w:type="spellEnd"/>
+      <w:proofErr w:type="gramEnd"/>
       <w:r>
         <w:rPr>
           <w:rFonts w:ascii="Calibri" w:hAnsi="Calibri" w:cs="Calibri"/>
@@ -507,6 +516,7 @@
         <w:t xml:space="preserve">B. </w:t>
       </w:r>
       <w:proofErr w:type="spellStart"/>
+      <w:proofErr w:type="gramStart"/>
       <w:r>
         <w:rPr>
           <w:rFonts w:ascii="Calibri" w:hAnsi="Calibri" w:cs="Calibri"/>
@@ -516,6 +526,7 @@
         <w:t>df.iloc</w:t>
       </w:r>
       <w:proofErr w:type="spellEnd"/>
+      <w:proofErr w:type="gramEnd"/>
       <w:r>
         <w:rPr>
           <w:rFonts w:ascii="Calibri" w:hAnsi="Calibri" w:cs="Calibri"/>
@@ -690,13 +701,41 @@
         <w:t>main_speaker</w:t>
       </w:r>
       <w:proofErr w:type="spellEnd"/>
-      <w:r>
-        <w:rPr>
-          <w:rFonts w:ascii="Calibri" w:hAnsi="Calibri" w:cs="Calibri"/>
-          <w:b/>
-          <w:bCs/>
-        </w:rPr>
-        <w:t>"]=="David Pogue"]["duration"]</w:t>
+      <w:proofErr w:type="gramStart"/>
+      <w:r>
+        <w:rPr>
+          <w:rFonts w:ascii="Calibri" w:hAnsi="Calibri" w:cs="Calibri"/>
+          <w:b/>
+          <w:bCs/>
+        </w:rPr>
+        <w:t>"]=</w:t>
+      </w:r>
+      <w:proofErr w:type="gramEnd"/>
+      <w:r>
+        <w:rPr>
+          <w:rFonts w:ascii="Calibri" w:hAnsi="Calibri" w:cs="Calibri"/>
+          <w:b/>
+          <w:bCs/>
+        </w:rPr>
+        <w:t>="David Pogue</w:t>
+      </w:r>
+      <w:proofErr w:type="gramStart"/>
+      <w:r>
+        <w:rPr>
+          <w:rFonts w:ascii="Calibri" w:hAnsi="Calibri" w:cs="Calibri"/>
+          <w:b/>
+          <w:bCs/>
+        </w:rPr>
+        <w:t>"][</w:t>
+      </w:r>
+      <w:proofErr w:type="gramEnd"/>
+      <w:r>
+        <w:rPr>
+          <w:rFonts w:ascii="Calibri" w:hAnsi="Calibri" w:cs="Calibri"/>
+          <w:b/>
+          <w:bCs/>
+        </w:rPr>
+        <w:t>"duration"]</w:t>
       </w:r>
       <w:r>
         <w:rPr>
@@ -840,6 +879,7 @@
         <w:t>(</w:t>
       </w:r>
       <w:proofErr w:type="spellStart"/>
+      <w:proofErr w:type="gramStart"/>
       <w:r>
         <w:rPr>
           <w:rFonts w:ascii="Calibri" w:hAnsi="Calibri" w:cs="Calibri"/>
@@ -847,6 +887,7 @@
         <w:t>df.rows</w:t>
       </w:r>
       <w:proofErr w:type="spellEnd"/>
+      <w:proofErr w:type="gramEnd"/>
       <w:r>
         <w:rPr>
           <w:rFonts w:ascii="Calibri" w:hAnsi="Calibri" w:cs="Calibri"/>
@@ -1100,7 +1141,21 @@
         <w:rPr>
           <w:rFonts w:ascii="Calibri" w:hAnsi="Calibri" w:cs="Calibri"/>
         </w:rPr>
-        <w:t>"].unique()</w:t>
+        <w:t>"</w:t>
+      </w:r>
+      <w:proofErr w:type="gramStart"/>
+      <w:r>
+        <w:rPr>
+          <w:rFonts w:ascii="Calibri" w:hAnsi="Calibri" w:cs="Calibri"/>
+        </w:rPr>
+        <w:t>].unique</w:t>
+      </w:r>
+      <w:proofErr w:type="gramEnd"/>
+      <w:r>
+        <w:rPr>
+          <w:rFonts w:ascii="Calibri" w:hAnsi="Calibri" w:cs="Calibri"/>
+        </w:rPr>
+        <w:t>()</w:t>
       </w:r>
       <w:r>
         <w:rPr>
@@ -1168,7 +1223,25 @@
           <w:b/>
           <w:bCs/>
         </w:rPr>
-        <w:t>"].unique())</w:t>
+        <w:t>"</w:t>
+      </w:r>
+      <w:proofErr w:type="gramStart"/>
+      <w:r>
+        <w:rPr>
+          <w:rFonts w:ascii="Calibri" w:hAnsi="Calibri" w:cs="Calibri"/>
+          <w:b/>
+          <w:bCs/>
+        </w:rPr>
+        <w:t>].unique</w:t>
+      </w:r>
+      <w:proofErr w:type="gramEnd"/>
+      <w:r>
+        <w:rPr>
+          <w:rFonts w:ascii="Calibri" w:hAnsi="Calibri" w:cs="Calibri"/>
+          <w:b/>
+          <w:bCs/>
+        </w:rPr>
+        <w:t>())</w:t>
       </w:r>
       <w:r>
         <w:rPr>

</xml_diff>